<commit_message>
WTB_API: Se finalizo la implementacion del componente Project (DTO, Controller, Service, Repository, Validator), se testeo y todo funcinoa perfectamente
</commit_message>
<xml_diff>
--- a/Relaciones Entre Componentes API.docx
+++ b/Relaciones Entre Componentes API.docx
@@ -214,6 +214,231 @@
       <w:proofErr w:type="spellEnd"/>
       <w:r>
         <w:t xml:space="preserve"> configura todo el sistema</w:t>
+      </w:r>
+    </w:p>
+    <w:p/>
+    <w:p>
+      <w:proofErr w:type="spellStart"/>
+      <w:r>
+        <w:rPr>
+          <w:b/>
+          <w:bCs/>
+        </w:rPr>
+        <w:t>Controllers</w:t>
+      </w:r>
+      <w:proofErr w:type="spellEnd"/>
+      <w:r>
+        <w:rPr>
+          <w:b/>
+          <w:bCs/>
+        </w:rPr>
+        <w:t xml:space="preserve">: </w:t>
+      </w:r>
+      <w:r>
+        <w:t>Encargado de recibir las solicitudes del cliente (</w:t>
+      </w:r>
+      <w:proofErr w:type="spellStart"/>
+      <w:r>
+        <w:t>Create</w:t>
+      </w:r>
+      <w:proofErr w:type="spellEnd"/>
+      <w:r>
+        <w:t xml:space="preserve">, </w:t>
+      </w:r>
+      <w:proofErr w:type="spellStart"/>
+      <w:r>
+        <w:t>Update</w:t>
+      </w:r>
+      <w:proofErr w:type="spellEnd"/>
+      <w:r>
+        <w:t xml:space="preserve">, </w:t>
+      </w:r>
+      <w:proofErr w:type="spellStart"/>
+      <w:r>
+        <w:t>Delete</w:t>
+      </w:r>
+      <w:proofErr w:type="spellEnd"/>
+      <w:r>
+        <w:t>)</w:t>
+      </w:r>
+      <w:r>
+        <w:t xml:space="preserve"> usando las peticiones POST, GET, DELETE, se comunica con </w:t>
+      </w:r>
+      <w:proofErr w:type="spellStart"/>
+      <w:r>
+        <w:rPr>
+          <w:b/>
+          <w:bCs/>
+        </w:rPr>
+        <w:t>Services</w:t>
+      </w:r>
+      <w:proofErr w:type="spellEnd"/>
+    </w:p>
+    <w:p>
+      <w:pPr>
+        <w:rPr>
+          <w:b/>
+          <w:bCs/>
+        </w:rPr>
+      </w:pPr>
+      <w:proofErr w:type="spellStart"/>
+      <w:r>
+        <w:rPr>
+          <w:b/>
+          <w:bCs/>
+        </w:rPr>
+        <w:t>Services</w:t>
+      </w:r>
+      <w:proofErr w:type="spellEnd"/>
+      <w:r>
+        <w:rPr>
+          <w:b/>
+          <w:bCs/>
+        </w:rPr>
+        <w:t xml:space="preserve">: </w:t>
+      </w:r>
+      <w:r>
+        <w:t xml:space="preserve">Encargado de hacer toda la lógica de la aplicación, velar por que todas las restricciones se cumplan, indica como se ejecutan las acciones de guardar, actualizar, borrar, obtener listado del producto recibido o enviado por el </w:t>
+      </w:r>
+      <w:proofErr w:type="spellStart"/>
+      <w:r>
+        <w:rPr>
+          <w:b/>
+          <w:bCs/>
+        </w:rPr>
+        <w:t>Controller</w:t>
+      </w:r>
+      <w:proofErr w:type="spellEnd"/>
+      <w:r>
+        <w:rPr>
+          <w:b/>
+          <w:bCs/>
+        </w:rPr>
+        <w:t xml:space="preserve">, </w:t>
+      </w:r>
+      <w:r>
+        <w:t>depende de</w:t>
+      </w:r>
+      <w:r>
+        <w:rPr>
+          <w:b/>
+          <w:bCs/>
+        </w:rPr>
+        <w:t xml:space="preserve"> </w:t>
+      </w:r>
+      <w:proofErr w:type="spellStart"/>
+      <w:r>
+        <w:rPr>
+          <w:b/>
+          <w:bCs/>
+        </w:rPr>
+        <w:t>Repository</w:t>
+      </w:r>
+      <w:proofErr w:type="spellEnd"/>
+    </w:p>
+    <w:p>
+      <w:proofErr w:type="spellStart"/>
+      <w:r>
+        <w:rPr>
+          <w:b/>
+          <w:bCs/>
+        </w:rPr>
+        <w:t>Repositories</w:t>
+      </w:r>
+      <w:proofErr w:type="spellEnd"/>
+      <w:r>
+        <w:rPr>
+          <w:b/>
+          <w:bCs/>
+        </w:rPr>
+        <w:t xml:space="preserve">: </w:t>
+      </w:r>
+      <w:r>
+        <w:t>Es el encargado de definir qué es lo que el componente puede hacer</w:t>
+      </w:r>
+      <w:r>
+        <w:t>, el</w:t>
+      </w:r>
+      <w:r>
+        <w:rPr>
+          <w:b/>
+          <w:bCs/>
+        </w:rPr>
+        <w:t xml:space="preserve"> </w:t>
+      </w:r>
+      <w:proofErr w:type="gramStart"/>
+      <w:r>
+        <w:rPr>
+          <w:b/>
+          <w:bCs/>
+        </w:rPr>
+        <w:t>Interface</w:t>
+      </w:r>
+      <w:proofErr w:type="gramEnd"/>
+      <w:r>
+        <w:rPr>
+          <w:b/>
+          <w:bCs/>
+        </w:rPr>
+        <w:t xml:space="preserve"> </w:t>
+      </w:r>
+      <w:r>
+        <w:t xml:space="preserve">define las funciones que se podrán ejecutar y el </w:t>
+      </w:r>
+      <w:proofErr w:type="spellStart"/>
+      <w:r>
+        <w:rPr>
+          <w:b/>
+          <w:bCs/>
+        </w:rPr>
+        <w:t>Repository</w:t>
+      </w:r>
+      <w:proofErr w:type="spellEnd"/>
+      <w:r>
+        <w:t xml:space="preserve"> define como se hacen esas funciones.</w:t>
+      </w:r>
+    </w:p>
+    <w:p>
+      <w:proofErr w:type="spellStart"/>
+      <w:r>
+        <w:rPr>
+          <w:b/>
+          <w:bCs/>
+        </w:rPr>
+        <w:t>DbContext</w:t>
+      </w:r>
+      <w:proofErr w:type="spellEnd"/>
+      <w:r>
+        <w:rPr>
+          <w:b/>
+          <w:bCs/>
+        </w:rPr>
+        <w:t xml:space="preserve">: </w:t>
+      </w:r>
+      <w:r>
+        <w:t xml:space="preserve">Es el encargado de traducir las peticiones u ordenes que recibe y ejecutarlas en la base de datos, por decirlo así traduce de C# a </w:t>
+      </w:r>
+      <w:proofErr w:type="spellStart"/>
+      <w:r>
+        <w:t>Transact</w:t>
+      </w:r>
+      <w:proofErr w:type="spellEnd"/>
+      <w:r>
+        <w:t xml:space="preserve"> lo cual el diseño</w:t>
+      </w:r>
+      <w:r>
+        <w:t xml:space="preserve"> </w:t>
+      </w:r>
+      <w:r>
+        <w:t xml:space="preserve">de la base de datos tiene que estar en el </w:t>
+      </w:r>
+      <w:proofErr w:type="spellStart"/>
+      <w:r>
+        <w:t>DbContext</w:t>
+      </w:r>
+      <w:proofErr w:type="spellEnd"/>
+      <w:r>
+        <w:t xml:space="preserve"> expresado en C#</w:t>
       </w:r>
     </w:p>
     <w:p/>
@@ -950,6 +1175,7 @@
   <w:style w:type="character" w:default="1" w:styleId="Fuentedeprrafopredeter">
     <w:name w:val="Default Paragraph Font"/>
     <w:uiPriority w:val="1"/>
+    <w:semiHidden/>
     <w:unhideWhenUsed/>
   </w:style>
   <w:style w:type="table" w:default="1" w:styleId="Tablanormal">

</xml_diff>